<commit_message>
Restore original data-collection dates, add session distribution to Figure 3 legend, re-verify files
Co-Authored-By: Claude Sonnet 5.5 <noreply@anthropic.com>
Claude-Session: https://claude.ai/code/session_01UT78gMSkWEvgo1YX92uAWM
</commit_message>
<xml_diff>
--- a/stroke_revision/Manuscript_Revised_Clean.docx
+++ b/stroke_revision/Manuscript_Revised_Clean.docx
@@ -2490,7 +2490,7 @@
         <w:rPr>
           <w:rFonts w:asciiTheme="majorBidi" w:hAnsiTheme="majorBidi" w:cstheme="majorBidi"/>
         </w:rPr>
-        <w:t xml:space="preserve">Data for the main study were collected between 15 September 2025 and March 2026.</w:t>
+        <w:t xml:space="preserve">Data were collected between August 2025 and March 2026.</w:t>
       </w:r>
     </w:p>
     <w:p>
@@ -2955,7 +2955,7 @@
           <w:sz w:val="20"/>
           <w:szCs w:val="20"/>
         </w:rPr>
-        <w:t xml:space="preserve">. The inpatient and outpatient phases are shown separately. Components A–D are intervention targets; the five tools shown at the bottom are the measured outcomes. Swallowing safety (component B) was an intervention component and was not measured as an outcome.</w:t>
+        <w:t xml:space="preserve">. The inpatient and outpatient phases are shown separately. Components A–D are intervention targets; the five tools shown at the bottom are the measured outcomes. Sessions 1–4 were scheduled during hospitalisation and sessions 5–16 after discharge. Swallowing safety (component B) was an intervention component and was not measured as an outcome.</w:t>
       </w:r>
     </w:p>
     <w:p>
@@ -3702,7 +3702,7 @@
         <w:rPr>
           <w:rFonts w:asciiTheme="majorBidi" w:hAnsiTheme="majorBidi" w:cstheme="majorBidi"/>
         </w:rPr>
-        <w:t xml:space="preserve">A pilot study was conducted with 16 patients, approximately 10% of the target sample of 160, to evaluate tool clarity, recruitment feasibility, session flow, assessment timing, safety procedures, and data-collection workflow. Pilot participants were recruited and screened separately before main-study recruitment began (26 August to 14 September 2025), were not included among the 218 patients screened for the main study, did not subsequently enter the main study, and were excluded from all analyses. The pilot was not used to estimate the sample size, which was determined solely by the a priori power analysis. Findings informed refinements to session sequencing, documentation procedures, and assessment logistics.</w:t>
+        <w:t xml:space="preserve">A pilot study was conducted with 16 patients, approximately 10% of the target sample of 160, to evaluate tool clarity, recruitment feasibility, session flow, assessment timing, safety procedures, and data-collection workflow. Pilot participants were recruited and screened separately before main-study recruitment began (August 2025), were not included among the 218 patients screened for the main study, did not subsequently enter the main study, and were excluded from all analyses. The pilot was not used to estimate the sample size, which was determined solely by the a priori power analysis. Findings informed refinements to session sequencing, documentation procedures, and assessment logistics.</w:t>
       </w:r>
     </w:p>
     <w:p>

</xml_diff>